<commit_message>
Add SIM MARISMART screenshot as Rajah 1 and mark checklist item 6 complete
Co-Authored-By: Claude Opus 5.5 <noreply@anthropic.com>
Claude-Session: https://claude.ai/code/session_01PeYzJs9oagP45KcKwom4qc
</commit_message>
<xml_diff>
--- a/output/MARISMART_AR_Lampiran_D_Senarai_Semak.docx
+++ b/output/MARISMART_AR_Lampiran_D_Senarai_Semak.docx
@@ -1165,7 +1165,7 @@
               <w:bottom w:val="single" w:color="9A9A9A" w:sz="4"/>
               <w:right w:val="single" w:color="9A9A9A" w:sz="4"/>
             </w:tcBorders>
-            <w:shd w:fill="FFF2CC" w:color="auto" w:val="clear"/>
+            <w:shd w:fill="E2EFDA" w:color="auto" w:val="clear"/>
             <w:tcMar>
               <w:top w:type="dxa" w:w="60"/>
               <w:left w:type="dxa" w:w="90"/>
@@ -1187,7 +1187,7 @@
                 <w:sz w:val="18"/>
                 <w:szCs w:val="18"/>
               </w:rPr>
-              <w:t xml:space="preserve">☐ Tindakan diperlukan</w:t>
+              <w:t xml:space="preserve">☑ Lengkap</w:t>
             </w:r>
           </w:p>
         </w:tc>
@@ -1218,7 +1218,7 @@
                 <w:sz w:val="18"/>
                 <w:szCs w:val="18"/>
               </w:rPr>
-              <w:t xml:space="preserve">Jadual 1–13 dan Jadual A1, B1, C1 bernombor, bertajuk dan dirujuk dalam teks. Poster: Rajah 1 dan Rajah 2 (graf impak).</w:t>
+              <w:t xml:space="preserve">Jadual 1–13 dan Jadual A1, B1, C1 bernombor dan bertajuk. Rajah 1 (tangkapan skrin SIM MARISMART), Rajah 2 (aliran uji rintis) dan Rajah 3 (graf impak) dirujuk dalam Bahagian 6.1, 4.6 dan 7. Poster: Rajah 1 dan Rajah 2.</w:t>
             </w:r>
           </w:p>
         </w:tc>
@@ -1249,7 +1249,7 @@
                 <w:sz w:val="18"/>
                 <w:szCs w:val="18"/>
               </w:rPr>
-              <w:t xml:space="preserve">Masukkan tangkapan skrin SIM MARISMART (Rajah 1) dan foto sesi uji rintis (Rajah 2) dalam laporan.</w:t>
+              <w:t xml:space="preserve">—</w:t>
             </w:r>
           </w:p>
         </w:tc>
@@ -1594,7 +1594,7 @@
           <w:sz w:val="18"/>
           <w:szCs w:val="18"/>
         </w:rPr>
-        <w:t xml:space="preserve">Ringkasan: 3 daripada 8 perkara lengkap. 5 perkara memerlukan tindakan susulan sebelum penghantaran akhir.</w:t>
+        <w:t xml:space="preserve">Ringkasan: 4 daripada 8 perkara lengkap. 4 perkara memerlukan tindakan susulan sebelum penghantaran akhir.</w:t>
       </w:r>
     </w:p>
     <w:p>

</xml_diff>

<commit_message>
Regenerate Lampiran D (7/8 complete) and sync item 4 status in report
Co-Authored-By: Claude Opus 5.5 <noreply@anthropic.com>
Claude-Session: https://claude.ai/code/session_01PeYzJs9oagP45KcKwom4qc
</commit_message>
<xml_diff>
--- a/output/MARISMART_AR_Lampiran_D_Senarai_Semak.docx
+++ b/output/MARISMART_AR_Lampiran_D_Senarai_Semak.docx
@@ -517,7 +517,7 @@
               <w:bottom w:val="single" w:color="9A9A9A" w:sz="4"/>
               <w:right w:val="single" w:color="9A9A9A" w:sz="4"/>
             </w:tcBorders>
-            <w:shd w:fill="FFF2CC" w:color="auto" w:val="clear"/>
+            <w:shd w:fill="E2EFDA" w:color="auto" w:val="clear"/>
             <w:tcMar>
               <w:top w:type="dxa" w:w="60"/>
               <w:left w:type="dxa" w:w="90"/>
@@ -539,7 +539,7 @@
                 <w:sz w:val="18"/>
                 <w:szCs w:val="18"/>
               </w:rPr>
-              <w:t xml:space="preserve">☐ Tindakan diperlukan</w:t>
+              <w:t xml:space="preserve">☑ Lengkap</w:t>
             </w:r>
           </w:p>
         </w:tc>
@@ -570,7 +570,7 @@
                 <w:sz w:val="18"/>
                 <w:szCs w:val="18"/>
               </w:rPr>
-              <w:t xml:space="preserve">Pautan demo sim-marismart-course.mohdasrizan.chatgpt.site dimasukkan dalam Maklumat Kumpulan (laporan) dan Bahagian 10 poster; kod QR dijana dalam poster.</w:t>
+              <w:t xml:space="preserve">Pautan demo sim-marismart-course.mohdasrizan.chatgpt.site (Maklumat Kumpulan laporan dan Bahagian 10 poster) dan kod QR poster telah diuji oleh kumpulan tanpa log masuk.</w:t>
             </w:r>
           </w:p>
         </w:tc>
@@ -601,7 +601,7 @@
                 <w:sz w:val="18"/>
                 <w:szCs w:val="18"/>
               </w:rPr>
-              <w:t xml:space="preserve">Buka pautan dalam tetingkap incognito (tanpa log masuk) dan imbas kod QR selepas cetak. Sediakan video demo jika diperlukan.</w:t>
+              <w:t xml:space="preserve">—</w:t>
             </w:r>
           </w:p>
         </w:tc>
@@ -732,7 +732,7 @@
                 <w:sz w:val="18"/>
                 <w:szCs w:val="18"/>
               </w:rPr>
-              <w:t xml:space="preserve">NOSS H501-002-3:2017 dan H501-002-2:2017 dirujuk [2][3]; senarai rujukan [1]–[5] format APA; gambar konsep poster dilabel “Ilustrasi konsep (dijana AI)”; Bahagian 2.3.</w:t>
+              <w:t xml:space="preserve">NOSS H501-002-3:2017 dan H501-002-2:2017 dirujuk [2][3]; rujukan [1]–[5] format APA; imej dijana AI dilabel (Rajah 4 laporan, Rajah 1 poster); Bahagian 2.3.</w:t>
             </w:r>
           </w:p>
         </w:tc>
@@ -894,7 +894,7 @@
                 <w:sz w:val="18"/>
                 <w:szCs w:val="18"/>
               </w:rPr>
-              <w:t xml:space="preserve">Bahagian 5 dan Jadual 8 (platform ChatGPT/GPT-5, tujuan, peranan manusia, risiko, kawalan); Bahagian 5.1; Lampiran C (Jadual C1, 4 entri log).</w:t>
+              <w:t xml:space="preserve">Bahagian 5 dan Jadual 8; Bahagian 5.1; Lampiran C (Jadual C1, 5 entri: 4 entri ChatGPT/GPT-5 bertarikh 20/09/2026 dan 1 entri video orientasi bertarikh 01/10/2026).</w:t>
             </w:r>
           </w:p>
         </w:tc>
@@ -925,7 +925,7 @@
                 <w:sz w:val="18"/>
                 <w:szCs w:val="18"/>
               </w:rPr>
-              <w:t xml:space="preserve">Isi tarikh entri ke-4 Lampiran C (pembinaan prototaip).</w:t>
+              <w:t xml:space="preserve">Isi nama alat penjana video bagi entri 01/10/2026 dalam Lampiran C.</w:t>
             </w:r>
           </w:p>
         </w:tc>
@@ -1003,7 +1003,7 @@
               <w:bottom w:val="single" w:color="9A9A9A" w:sz="4"/>
               <w:right w:val="single" w:color="9A9A9A" w:sz="4"/>
             </w:tcBorders>
-            <w:shd w:fill="FFF2CC" w:color="auto" w:val="clear"/>
+            <w:shd w:fill="E2EFDA" w:color="auto" w:val="clear"/>
             <w:tcMar>
               <w:top w:type="dxa" w:w="60"/>
               <w:left w:type="dxa" w:w="90"/>
@@ -1025,7 +1025,7 @@
                 <w:sz w:val="18"/>
                 <w:szCs w:val="18"/>
               </w:rPr>
-              <w:t xml:space="preserve">☐ Tindakan diperlukan</w:t>
+              <w:t xml:space="preserve">☑ Lengkap</w:t>
             </w:r>
           </w:p>
         </w:tc>
@@ -1056,7 +1056,7 @@
                 <w:sz w:val="18"/>
                 <w:szCs w:val="18"/>
               </w:rPr>
-              <w:t xml:space="preserve">Data uji rintis 30/09/2026 (13 pelajar, 2 pengajar) direkod oleh SIM MARISMART; instrumen UAT dalam Lampiran B; keputusan dalam Jadual 10; analisis perubahan relatif dalam Bahagian 7.</w:t>
+              <w:t xml:space="preserve">Data uji rintis 30/09/2026 (13 pelajar, 2 pengajar) direkod oleh SIM MARISMART; instrumen UAT dalam Lampiran B (min keseluruhan 4.5/5); keputusan dalam Jadual 10; analisis dalam Bahagian 7 dan Rajah 3.</w:t>
             </w:r>
           </w:p>
         </w:tc>
@@ -1087,7 +1087,7 @@
                 <w:sz w:val="18"/>
                 <w:szCs w:val="18"/>
               </w:rPr>
-              <w:t xml:space="preserve">Isi min setiap item UAT (Lampiran B). Simpan eksport/tangkapan skrin rekod SIM MARISMART sebagai bukti audit.</w:t>
+              <w:t xml:space="preserve">—</w:t>
             </w:r>
           </w:p>
         </w:tc>
@@ -1218,7 +1218,7 @@
                 <w:sz w:val="18"/>
                 <w:szCs w:val="18"/>
               </w:rPr>
-              <w:t xml:space="preserve">Jadual 1–13 dan Jadual A1, B1, C1 bernombor dan bertajuk. Rajah 1 (tangkapan skrin SIM MARISMART), Rajah 2 (aliran uji rintis) dan Rajah 3 (graf impak) dirujuk dalam Bahagian 6.1, 4.6 dan 7. Poster: Rajah 1 dan Rajah 2.</w:t>
+              <w:t xml:space="preserve">Jadual 1–13 dan Jadual A1, B1, C1. Rajah 1 (tangkapan skrin SIM MARISMART), Rajah 2 (aliran uji rintis), Rajah 3 (graf impak) dan Rajah 4 (video orientasi, dijana AI) dirujuk dalam Bahagian 4.6, 6.1 dan 7. Poster: Rajah 1 dan Rajah 2.</w:t>
             </w:r>
           </w:p>
         </w:tc>
@@ -1489,7 +1489,7 @@
               <w:bottom w:val="single" w:color="9A9A9A" w:sz="4"/>
               <w:right w:val="single" w:color="9A9A9A" w:sz="4"/>
             </w:tcBorders>
-            <w:shd w:fill="FFF2CC" w:color="auto" w:val="clear"/>
+            <w:shd w:fill="E2EFDA" w:color="auto" w:val="clear"/>
             <w:tcMar>
               <w:top w:type="dxa" w:w="60"/>
               <w:left w:type="dxa" w:w="90"/>
@@ -1511,7 +1511,7 @@
                 <w:sz w:val="18"/>
                 <w:szCs w:val="18"/>
               </w:rPr>
-              <w:t xml:space="preserve">☐ Tindakan diperlukan</w:t>
+              <w:t xml:space="preserve">☑ Lengkap</w:t>
             </w:r>
           </w:p>
         </w:tc>
@@ -1542,7 +1542,7 @@
                 <w:sz w:val="18"/>
                 <w:szCs w:val="18"/>
               </w:rPr>
-              <w:t xml:space="preserve">Laporan utama (Bahagian 1–11) dianggarkan sekitar 12–14 muka surat berdasarkan senarai kandungan asal.</w:t>
+              <w:t xml:space="preserve">Bilangan muka surat laporan utama (Bahagian 1–11) telah disemak oleh kumpulan selepas Senarai Kandungan dikemas kini.</w:t>
             </w:r>
           </w:p>
         </w:tc>
@@ -1573,7 +1573,7 @@
                 <w:sz w:val="18"/>
                 <w:szCs w:val="18"/>
               </w:rPr>
-              <w:t xml:space="preserve">Dalam Word: klik kanan Senarai Kandungan → Update Field, kemudian sahkan bilangan muka surat.</w:t>
+              <w:t xml:space="preserve">—</w:t>
             </w:r>
           </w:p>
         </w:tc>
@@ -1594,7 +1594,7 @@
           <w:sz w:val="18"/>
           <w:szCs w:val="18"/>
         </w:rPr>
-        <w:t xml:space="preserve">Ringkasan: 4 daripada 8 perkara lengkap. 4 perkara memerlukan tindakan susulan sebelum penghantaran akhir.</w:t>
+        <w:t xml:space="preserve">Ringkasan: 7 daripada 8 perkara lengkap. 1 perkara memerlukan tindakan susulan sebelum penghantaran akhir.</w:t>
       </w:r>
     </w:p>
     <w:p>

</xml_diff>

<commit_message>
Record Google Flow as video tool in Lampiran C; Lampiran D now complete
Co-Authored-By: Claude Opus 5.5 <noreply@anthropic.com>
Claude-Session: https://claude.ai/code/session_01PeYzJs9oagP45KcKwom4qc
</commit_message>
<xml_diff>
--- a/output/MARISMART_AR_Lampiran_D_Senarai_Semak.docx
+++ b/output/MARISMART_AR_Lampiran_D_Senarai_Semak.docx
@@ -841,7 +841,7 @@
               <w:bottom w:val="single" w:color="9A9A9A" w:sz="4"/>
               <w:right w:val="single" w:color="9A9A9A" w:sz="4"/>
             </w:tcBorders>
-            <w:shd w:fill="FFF2CC" w:color="auto" w:val="clear"/>
+            <w:shd w:fill="E2EFDA" w:color="auto" w:val="clear"/>
             <w:tcMar>
               <w:top w:type="dxa" w:w="60"/>
               <w:left w:type="dxa" w:w="90"/>
@@ -863,7 +863,7 @@
                 <w:sz w:val="18"/>
                 <w:szCs w:val="18"/>
               </w:rPr>
-              <w:t xml:space="preserve">☐ Tindakan diperlukan</w:t>
+              <w:t xml:space="preserve">☑ Lengkap</w:t>
             </w:r>
           </w:p>
         </w:tc>
@@ -894,7 +894,7 @@
                 <w:sz w:val="18"/>
                 <w:szCs w:val="18"/>
               </w:rPr>
-              <w:t xml:space="preserve">Bahagian 5 dan Jadual 8; Bahagian 5.1; Lampiran C (Jadual C1, 5 entri: 4 entri ChatGPT/GPT-5 bertarikh 20/09/2026 dan 1 entri video orientasi bertarikh 01/10/2026).</w:t>
+              <w:t xml:space="preserve">Bahagian 5 dan Jadual 8; Bahagian 5.1; Lampiran C (Jadual C1, 5 entri: 4 entri ChatGPT/GPT-5 bertarikh 20/09/2026 dan 1 entri Google Flow untuk video orientasi bertarikh 01/10/2026).</w:t>
             </w:r>
           </w:p>
         </w:tc>
@@ -925,7 +925,7 @@
                 <w:sz w:val="18"/>
                 <w:szCs w:val="18"/>
               </w:rPr>
-              <w:t xml:space="preserve">Isi nama alat penjana video bagi entri 01/10/2026 dalam Lampiran C.</w:t>
+              <w:t xml:space="preserve">—</w:t>
             </w:r>
           </w:p>
         </w:tc>
@@ -1594,7 +1594,7 @@
           <w:sz w:val="18"/>
           <w:szCs w:val="18"/>
         </w:rPr>
-        <w:t xml:space="preserve">Ringkasan: 7 daripada 8 perkara lengkap. 1 perkara memerlukan tindakan susulan sebelum penghantaran akhir.</w:t>
+        <w:t xml:space="preserve">Ringkasan: 8 daripada 8 perkara lengkap. 0 perkara memerlukan tindakan susulan sebelum penghantaran akhir.</w:t>
       </w:r>
     </w:p>
     <w:p>

</xml_diff>